<commit_message>
feat(viceri-study): publish specification and test suite v1.2
</commit_message>
<xml_diff>
--- a/output/docx/AdministradorEditaTerminal.docx
+++ b/output/docx/AdministradorEditaTerminal.docx
@@ -1594,7 +1594,7 @@
           <w:sz w:val="24"/>
           <w:color w:val="2B6CB0"/>
         </w:rPr>
-        <w:t>[TC7] Exception Flow 1: Usuario nao preenche algum campo obrigatorio</w:t>
+        <w:t>[TC7] Alternative Flow 6: Volta para tela inicial de sistema</w:t>
       </w:r>
     </w:p>
     <w:p>
@@ -1630,7 +1630,7 @@
         <w:rPr>
           <w:sz w:val="20"/>
         </w:rPr>
-        <w:t>Flow interrupted due to exception / error</w:t>
+        <w:t>O Terminal foi atualizado com sucesso.</w:t>
       </w:r>
     </w:p>
     <w:tbl>
@@ -1753,6 +1753,260 @@
               <w:rPr>
                 <w:sz w:val="18"/>
               </w:rPr>
+              <w:t>Administrador: clica no botao Voltar</w:t>
+            </w:r>
+          </w:p>
+        </w:tc>
+        <w:tc>
+          <w:p>
+            <w:r>
+              <w:rPr>
+                <w:sz w:val="18"/>
+              </w:rPr>
+              <w:t>SYSTEM exibe uma lista com os Terminais cadastrados</w:t>
+            </w:r>
+          </w:p>
+        </w:tc>
+      </w:tr>
+      <w:tr>
+        <w:tc>
+          <w:p>
+            <w:r>
+              <w:rPr>
+                <w:sz w:val="18"/>
+              </w:rPr>
+              <w:t>3</w:t>
+            </w:r>
+          </w:p>
+        </w:tc>
+        <w:tc>
+          <w:p>
+            <w:r>
+              <w:rPr>
+                <w:sz w:val="18"/>
+              </w:rPr>
+              <w:t>Administrador: clica em um dos terminais listados</w:t>
+            </w:r>
+          </w:p>
+        </w:tc>
+        <w:tc>
+          <w:p>
+            <w:r>
+              <w:rPr>
+                <w:sz w:val="18"/>
+              </w:rPr>
+              <w:t>SYSTEM exibe tela de edicao de Terminal</w:t>
+            </w:r>
+          </w:p>
+        </w:tc>
+      </w:tr>
+      <w:tr>
+        <w:tc>
+          <w:p>
+            <w:r>
+              <w:rPr>
+                <w:sz w:val="18"/>
+              </w:rPr>
+              <w:t>4</w:t>
+            </w:r>
+          </w:p>
+        </w:tc>
+        <w:tc>
+          <w:p>
+            <w:r>
+              <w:rPr>
+                <w:sz w:val="18"/>
+              </w:rPr>
+              <w:t>Administrador: altera dados do terminal e clica no botao de 'Atualizar'</w:t>
+            </w:r>
+          </w:p>
+        </w:tc>
+        <w:tc>
+          <w:p>
+            <w:r>
+              <w:rPr>
+                <w:sz w:val="18"/>
+              </w:rPr>
+              <w:t>SYSTEM notifica usuario de que Terminal foi atualizado com sucesso</w:t>
+            </w:r>
+          </w:p>
+        </w:tc>
+      </w:tr>
+    </w:tbl>
+    <w:p>
+      <w:r>
+        <w:br/>
+      </w:r>
+    </w:p>
+    <w:p>
+      <w:pPr>
+        <w:spacing w:before="180" w:after="60"/>
+      </w:pPr>
+      <w:r>
+        <w:rPr>
+          <w:b w:val="on"/>
+          <w:sz w:val="24"/>
+          <w:color w:val="2B6CB0"/>
+        </w:rPr>
+        <w:t>[TC8] Exception Flow 1: Usuario nao preenche algum campo obrigatorio</w:t>
+      </w:r>
+    </w:p>
+    <w:p>
+      <w:pPr>
+        <w:spacing w:after="40"/>
+      </w:pPr>
+      <w:r>
+        <w:rPr>
+          <w:b w:val="on"/>
+          <w:sz w:val="20"/>
+        </w:rPr>
+        <w:t xml:space="preserve">Preconditions: </w:t>
+      </w:r>
+      <w:r>
+        <w:rPr>
+          <w:sz w:val="20"/>
+        </w:rPr>
+        <w:t>Usuario Administrador esta logado no sistema</w:t>
+      </w:r>
+    </w:p>
+    <w:p>
+      <w:pPr>
+        <w:spacing w:after="40"/>
+      </w:pPr>
+      <w:r>
+        <w:rPr>
+          <w:b w:val="on"/>
+          <w:sz w:val="20"/>
+        </w:rPr>
+        <w:t xml:space="preserve">Postconditions: </w:t>
+      </w:r>
+      <w:r>
+        <w:rPr>
+          <w:sz w:val="20"/>
+        </w:rPr>
+        <w:t>Flow interrupted due to exception / error</w:t>
+      </w:r>
+    </w:p>
+    <w:tbl>
+      <w:tblPr>
+        <w:tblW w:w="5000" w:type="pct"/>
+        <w:tblBorders>
+          <w:top w:val="single"/>
+          <w:left w:val="single"/>
+          <w:bottom w:val="single"/>
+          <w:right w:val="single"/>
+          <w:insideH w:val="single"/>
+          <w:insideV w:val="single"/>
+        </w:tblBorders>
+      </w:tblPr>
+      <w:tr>
+        <w:tc>
+          <w:tcPr>
+            <w:tcW w:w="1200" w:type="dxa"/>
+            <w:shd w:color="auto" w:val="clear" w:fill="2B6CB0"/>
+          </w:tcPr>
+          <w:p>
+            <w:pPr>
+              <w:jc w:val="left"/>
+            </w:pPr>
+            <w:r>
+              <w:rPr>
+                <w:b w:val="on"/>
+                <w:sz w:val="20"/>
+                <w:color w:val="FFFFFF"/>
+              </w:rPr>
+              <w:t>Step #</w:t>
+            </w:r>
+          </w:p>
+        </w:tc>
+        <w:tc>
+          <w:tcPr>
+            <w:tcW w:w="4500" w:type="dxa"/>
+            <w:shd w:color="auto" w:val="clear" w:fill="2B6CB0"/>
+          </w:tcPr>
+          <w:p>
+            <w:pPr>
+              <w:jc w:val="left"/>
+            </w:pPr>
+            <w:r>
+              <w:rPr>
+                <w:b w:val="on"/>
+                <w:sz w:val="20"/>
+                <w:color w:val="FFFFFF"/>
+              </w:rPr>
+              <w:t>Actor Action</w:t>
+            </w:r>
+          </w:p>
+        </w:tc>
+        <w:tc>
+          <w:tcPr>
+            <w:tcW w:w="4500" w:type="dxa"/>
+            <w:shd w:color="auto" w:val="clear" w:fill="2B6CB0"/>
+          </w:tcPr>
+          <w:p>
+            <w:pPr>
+              <w:jc w:val="left"/>
+            </w:pPr>
+            <w:r>
+              <w:rPr>
+                <w:b w:val="on"/>
+                <w:sz w:val="20"/>
+                <w:color w:val="FFFFFF"/>
+              </w:rPr>
+              <w:t>Expected Result (System)</w:t>
+            </w:r>
+          </w:p>
+        </w:tc>
+      </w:tr>
+      <w:tr>
+        <w:tc>
+          <w:p>
+            <w:r>
+              <w:rPr>
+                <w:sz w:val="18"/>
+              </w:rPr>
+              <w:t>1</w:t>
+            </w:r>
+          </w:p>
+        </w:tc>
+        <w:tc>
+          <w:p>
+            <w:r>
+              <w:rPr>
+                <w:sz w:val="18"/>
+              </w:rPr>
+              <w:t>Administrador: Entra na tela de Listagem de Terminais</w:t>
+            </w:r>
+          </w:p>
+        </w:tc>
+        <w:tc>
+          <w:p>
+            <w:r>
+              <w:rPr>
+                <w:sz w:val="18"/>
+              </w:rPr>
+              <w:t>SYSTEM exibe uma lista com os Terminais cadastrados</w:t>
+            </w:r>
+          </w:p>
+        </w:tc>
+      </w:tr>
+      <w:tr>
+        <w:tc>
+          <w:p>
+            <w:r>
+              <w:rPr>
+                <w:sz w:val="18"/>
+              </w:rPr>
+              <w:t>2</w:t>
+            </w:r>
+          </w:p>
+        </w:tc>
+        <w:tc>
+          <w:p>
+            <w:r>
+              <w:rPr>
+                <w:sz w:val="18"/>
+              </w:rPr>
               <w:t>Administrador: clica em um dos terminais listados</w:t>
             </w:r>
           </w:p>

</xml_diff>